<commit_message>
feat: băm mật khẩu SHA-256 CSDL, tái cấu trúc package gui/panels và controller theo chuẩn MVC
</commit_message>
<xml_diff>
--- a/BAO_CAO_DO_AN.docx
+++ b/BAO_CAO_DO_AN.docx
@@ -457,7 +457,7 @@
           <w:color w:val="1F2937"/>
           <w:sz w:val="21"/>
         </w:rPr>
-        <w:t>Giao diện Swing FlatLaf 3.4 đa vai trò (MainDashboard 5 Trụ cột, CheckInForm, QuanLyGoiTapPanel, ChiTietHoiVienPanel, MemberPortal). Tuyệt đối không chứa câu lệnh SQL.</w:t>
+        <w:t>Giao diện Swing FlatLaf 3.4 đa vai trò phân tầng chuẩn mực: com.nhom12.gym.gui (MainDashboard / MainForm, CheckInForm) và package con gui.panels (31 Panels nghiệp vụ). Tuyệt đối không chứa câu lệnh SQL.</w:t>
       </w:r>
     </w:p>
     <w:p>
@@ -472,7 +472,7 @@
           <w:color w:val="111827"/>
           <w:sz w:val="21"/>
         </w:rPr>
-        <w:t xml:space="preserve">2. Business Logic Layer (Service): </w:t>
+        <w:t xml:space="preserve">2. Controller &amp; Service Layer: </w:t>
       </w:r>
       <w:r>
         <w:rPr>
@@ -480,7 +480,7 @@
           <w:color w:val="1F2937"/>
           <w:sz w:val="21"/>
         </w:rPr>
-        <w:t>CheckInService (5 Business Rules + Anti-Passback 2 phút + VIP Secret + đo ms), AuthService (xác thực &amp; RBAC), BaoCaoService (doanh thu đa chi nhánh CN01 &amp; CN02, heatmap), HoiVienService.</w:t>
+        <w:t>Tầng Controller (com.nhom12.gym.controller) điều phối MVC; Tầng Service đóng gói 100% Business Rules (CheckInService 5 Rules + Anti-Passback, AuthService băm mật khẩu SHA-256, BaoCaoService, HoiVienService).</w:t>
       </w:r>
     </w:p>
     <w:p>
@@ -564,7 +564,7 @@
           <w:color w:val="111827"/>
           <w:sz w:val="21"/>
         </w:rPr>
-        <w:t xml:space="preserve">6. Cross-Cutting Utilities: </w:t>
+        <w:t xml:space="preserve">6. Cross-Cutting Utilities &amp; Security: </w:t>
       </w:r>
       <w:r>
         <w:rPr>
@@ -572,7 +572,7 @@
           <w:color w:val="1F2937"/>
           <w:sz w:val="21"/>
         </w:rPr>
-        <w:t>SoundHelper (sóng âm PCM 1200Hz/420Hz), ExcelExportHelper (BOM UTF-8 chuẩn tiếng Việt), ImageHelper (mã QR &amp; ảnh thẻ), ValidationHelper, Auth context.</w:t>
+        <w:t>PasswordUtil (Băm mật khẩu SHA-256 một chiều 64 hex), SoundHelper (sóng âm PCM 1200Hz/420Hz), ExcelExportHelper (BOM UTF-8 chuẩn tiếng Việt), ImageHelper (mã QR &amp; ảnh thẻ), ValidationHelper, Auth context.</w:t>
       </w:r>
     </w:p>
     <w:p>
@@ -595,7 +595,7 @@
           <w:color w:val="1F2937"/>
           <w:sz w:val="21"/>
         </w:rPr>
-        <w:t>Cơ sở dữ liệu quan hệ FitLifeGym trên MS SQL Server 2019/2022 với 8 bảng chuẩn hóa 3NF và chỉ mục tối ưu tìm kiếm.</w:t>
+        <w:t>Cơ sở dữ liệu quan hệ FitLifeGym trên MS SQL Server 2019/2022 với 8 bảng chuẩn hóa 3NF, bảo mật mật khẩu băm tại cột MatKhau VARCHAR(255) và chỉ mục tối ưu tìm kiếm.</w:t>
       </w:r>
     </w:p>
     <w:p>

</xml_diff>